<commit_message>
Checkpoint 7.1: hardened answer path, paper-corpus demo with refusal probes, completed worksheet
Co-Authored-By: Claude Sonnet 5.5 <noreply@anthropic.com>
</commit_message>
<xml_diff>
--- a/Capstone_Checkpoint_7.1/Tarundeep_Required_Capstone_Checkpoint_7_1_Worksheet.docx
+++ b/Capstone_Checkpoint_7.1/Tarundeep_Required_Capstone_Checkpoint_7_1_Worksheet.docx
@@ -500,11 +500,26 @@
           <w:p>
             <w:pPr>
               <w:spacing w:after="120"/>
-              <w:rPr>
-                <w:sz w:val="24"/>
-                <w:szCs w:val="24"/>
-              </w:rPr>
             </w:pPr>
+            <w:r>
+              <w:rPr>
+                <w:sz w:val="24"/>
+                <w:szCs w:val="24"/>
+              </w:rPr>
+              <w:t xml:space="preserve">Research Paper Navigator: an agent-based RAG system over 153 research-paper PDFs. Checkpoints 2.1-4.1 built ingestion, retrieval and graph retrieval with question decomposition; 5.1 added a planner-driven agent that loops over a graph_retrieve tool (step-capped) and answers with quotes from the retrieved text.</w:t>
+            </w:r>
+          </w:p>
+          <w:p>
+            <w:pPr>
+              <w:spacing w:after="120"/>
+            </w:pPr>
+            <w:r>
+              <w:rPr>
+                <w:sz w:val="24"/>
+                <w:szCs w:val="24"/>
+              </w:rPr>
+              <w:t xml:space="preserve">The 6.1 audit found: the no-retrieval path had no scope or refusal rule (role-play probe P1 succeeded); all 4 refusals (P1, P5, P7, P10) broke the required format; and a research question cost 3 calls, ~3.5k tokens and 5-11 s, with the answer call at 65% of input tokens.</w:t>
+            </w:r>
           </w:p>
         </w:tc>
       </w:tr>
@@ -599,11 +614,14 @@
           <w:p>
             <w:pPr>
               <w:spacing w:after="120"/>
-              <w:rPr>
-                <w:sz w:val="24"/>
-                <w:szCs w:val="24"/>
-              </w:rPr>
             </w:pPr>
+            <w:r>
+              <w:rPr>
+                <w:sz w:val="24"/>
+                <w:szCs w:val="24"/>
+              </w:rPr>
+              <w:t xml:space="preserve">Answer questions about the paper collection with grounded, quoted answers (e.g. VeriFair: 606 seconds, 28,000 samples), refuse out-of-scope, malicious or private requests in a fixed one-sentence format, and do so cheaply for repeated and simple questions.</w:t>
+            </w:r>
           </w:p>
         </w:tc>
       </w:tr>
@@ -869,11 +887,74 @@
           <w:p>
             <w:pPr>
               <w:spacing w:after="120"/>
-              <w:rPr>
-                <w:sz w:val="24"/>
-                <w:szCs w:val="24"/>
-              </w:rPr>
             </w:pPr>
+            <w:r>
+              <w:rPr>
+                <w:sz w:val="24"/>
+                <w:szCs w:val="24"/>
+              </w:rPr>
+              <w:t xml:space="preserve">Implemented in the 7.1 solution file:</w:t>
+            </w:r>
+          </w:p>
+          <w:p>
+            <w:pPr>
+              <w:spacing w:after="120"/>
+            </w:pPr>
+            <w:r>
+              <w:rPr>
+                <w:sz w:val="24"/>
+                <w:szCs w:val="24"/>
+              </w:rPr>
+              <w:t xml:space="preserve">1. Input sanitizer: escapes XML, removes pasted fake-source blocks, neutralizes 'ignore instructions' / 'act as' phrases; its output drives retrieval, the prompt and the cache key.</w:t>
+            </w:r>
+          </w:p>
+          <w:p>
+            <w:pPr>
+              <w:spacing w:after="120"/>
+            </w:pPr>
+            <w:r>
+              <w:rPr>
+                <w:sz w:val="24"/>
+                <w:szCs w:val="24"/>
+              </w:rPr>
+              <w:t xml:space="preserve">2. XML trust boundary: only &lt;documents&gt; is a trusted source; the question is data.</w:t>
+            </w:r>
+          </w:p>
+          <w:p>
+            <w:pPr>
+              <w:spacing w:after="120"/>
+            </w:pPr>
+            <w:r>
+              <w:rPr>
+                <w:sz w:val="24"/>
+                <w:szCs w:val="24"/>
+              </w:rPr>
+              <w:t xml:space="preserve">3. Scope and refusal rule in the answer prompt: one sentence, max 40 words, starting 'I cannot answer your request because'.</w:t>
+            </w:r>
+          </w:p>
+          <w:p>
+            <w:pPr>
+              <w:spacing w:after="120"/>
+            </w:pPr>
+            <w:r>
+              <w:rPr>
+                <w:sz w:val="24"/>
+                <w:szCs w:val="24"/>
+              </w:rPr>
+              <w:t xml:space="preserve">4. Output guard that enforces that refusal format in code.</w:t>
+            </w:r>
+          </w:p>
+          <w:p>
+            <w:pPr>
+              <w:spacing w:after="120"/>
+            </w:pPr>
+            <w:r>
+              <w:rPr>
+                <w:sz w:val="24"/>
+                <w:szCs w:val="24"/>
+              </w:rPr>
+              <w:t xml:space="preserve">5. Step cap and a call log.</w:t>
+            </w:r>
           </w:p>
         </w:tc>
       </w:tr>
@@ -963,11 +1044,14 @@
           <w:p>
             <w:pPr>
               <w:spacing w:after="120"/>
-              <w:rPr>
-                <w:sz w:val="24"/>
-                <w:szCs w:val="24"/>
-              </w:rPr>
             </w:pPr>
+            <w:r>
+              <w:rPr>
+                <w:sz w:val="24"/>
+                <w:szCs w:val="24"/>
+              </w:rPr>
+              <w:t xml:space="preserve">Each maps to a 6.1 finding: the missing refusal rule (P1 role-play), the refusal-format failures (4 of 4), injection through the user turn or a pasted fake source, and unbounded looping. Refusals are never cached, so an attack cannot be replayed from the cache.</w:t>
+            </w:r>
           </w:p>
         </w:tc>
       </w:tr>
@@ -1057,11 +1141,14 @@
           <w:p>
             <w:pPr>
               <w:spacing w:after="120"/>
-              <w:rPr>
-                <w:sz w:val="24"/>
-                <w:szCs w:val="24"/>
-              </w:rPr>
             </w:pPr>
+            <w:r>
+              <w:rPr>
+                <w:sz w:val="24"/>
+                <w:szCs w:val="24"/>
+              </w:rPr>
+              <w:t xml:space="preserve">Layered, because each layer fails differently: the regex sanitizer is cheap but misses paraphrases, so the XML boundary and prompt rule back it up, and the code-level guard covers a model that ignores the prompt. I sanitize before retrieval so injected keywords cannot steer it, and checked the real question is still answered.</w:t>
+            </w:r>
           </w:p>
         </w:tc>
       </w:tr>
@@ -1213,11 +1300,26 @@
           <w:p>
             <w:pPr>
               <w:spacing w:after="120"/>
-              <w:rPr>
-                <w:sz w:val="24"/>
-                <w:szCs w:val="24"/>
-              </w:rPr>
             </w:pPr>
+            <w:r>
+              <w:rPr>
+                <w:sz w:val="24"/>
+                <w:szCs w:val="24"/>
+              </w:rPr>
+              <w:t xml:space="preserve">1. Cache: repeated questions are served with zero tokens, keyed on the sanitized question (exact-match stand-in for a semantic cache).</w:t>
+            </w:r>
+          </w:p>
+          <w:p>
+            <w:pPr>
+              <w:spacing w:after="120"/>
+            </w:pPr>
+            <w:r>
+              <w:rPr>
+                <w:sz w:val="24"/>
+                <w:szCs w:val="24"/>
+              </w:rPr>
+              <w:t xml:space="preserve">2. Router: simple one-hop questions take a single-call direct path (top 3 passages); only multipart questions use the full agent loop.</w:t>
+            </w:r>
           </w:p>
         </w:tc>
       </w:tr>
@@ -1303,11 +1405,14 @@
           <w:p>
             <w:pPr>
               <w:spacing w:after="120"/>
-              <w:rPr>
-                <w:sz w:val="24"/>
-                <w:szCs w:val="24"/>
-              </w:rPr>
             </w:pPr>
+            <w:r>
+              <w:rPr>
+                <w:sz w:val="24"/>
+                <w:szCs w:val="24"/>
+              </w:rPr>
+              <w:t xml:space="preserve">6.1 showed 3 sequential calls per question and the answer call dominating input tokens. Many questions are single-fact lookups or repeats, so caching and a one-call path cut the most cost with the least quality risk. A cheaper planner model is planned next.</w:t>
+            </w:r>
           </w:p>
         </w:tc>
       </w:tr>
@@ -1469,11 +1574,50 @@
           <w:p>
             <w:pPr>
               <w:spacing w:after="120"/>
-              <w:rPr>
-                <w:sz w:val="24"/>
-                <w:szCs w:val="24"/>
-              </w:rPr>
             </w:pPr>
+            <w:r>
+              <w:rPr>
+                <w:sz w:val="24"/>
+                <w:szCs w:val="24"/>
+              </w:rPr>
+              <w:t xml:space="preserve">Refusal format on the 4 failed 6.1 probes: original prompt 0/4, hardened 4/4. P1 before: the agent played the interviewer; after: a one-sentence refusal.</w:t>
+            </w:r>
+          </w:p>
+          <w:p>
+            <w:pPr>
+              <w:spacing w:after="120"/>
+            </w:pPr>
+            <w:r>
+              <w:rPr>
+                <w:sz w:val="24"/>
+                <w:szCs w:val="24"/>
+              </w:rPr>
+              <w:t xml:space="preserve">Cache (Q1): miss 684 tokens / 1,831 ms; hit 0 tokens / 0 ms.</w:t>
+            </w:r>
+          </w:p>
+          <w:p>
+            <w:pPr>
+              <w:spacing w:after="120"/>
+            </w:pPr>
+            <w:r>
+              <w:rPr>
+                <w:sz w:val="24"/>
+                <w:szCs w:val="24"/>
+              </w:rPr>
+              <w:t xml:space="preserve">Direct path: 229-402 tokens per question vs 684 on the agent path (Q1 was routed to the agent path because the router matches ' and ').</w:t>
+            </w:r>
+          </w:p>
+          <w:p>
+            <w:pPr>
+              <w:spacing w:after="120"/>
+            </w:pPr>
+            <w:r>
+              <w:rPr>
+                <w:sz w:val="24"/>
+                <w:szCs w:val="24"/>
+              </w:rPr>
+              <w:t xml:space="preserve">Quality: VeriFair (606 s), Hectare (7x) and Stitch still answered correctly after sanitizing and routing.</w:t>
+            </w:r>
           </w:p>
         </w:tc>
       </w:tr>
@@ -1559,11 +1703,14 @@
           <w:p>
             <w:pPr>
               <w:spacing w:after="120"/>
-              <w:rPr>
-                <w:sz w:val="24"/>
-                <w:szCs w:val="24"/>
-              </w:rPr>
             </w:pPr>
+            <w:r>
+              <w:rPr>
+                <w:sz w:val="24"/>
+                <w:szCs w:val="24"/>
+              </w:rPr>
+              <w:t xml:space="preserve">The injection probe's sanitized turn kept the VeriFair question and dropped the chicken role-play and fake e-mail block; both raw and sanitized runs answered correctly (the hardened prompt was used in both). Full output: checkpoint_7_1_output.txt; call log: checkpoint_7_1_agent.log. Caveat: a 3-passage sample corpus and one run, so these show the mechanics, not production numbers.</w:t>
+            </w:r>
           </w:p>
         </w:tc>
       </w:tr>
@@ -1715,11 +1862,38 @@
           <w:p>
             <w:pPr>
               <w:spacing w:after="120"/>
-              <w:rPr>
-                <w:sz w:val="24"/>
-                <w:szCs w:val="24"/>
-              </w:rPr>
             </w:pPr>
+            <w:r>
+              <w:rPr>
+                <w:sz w:val="24"/>
+                <w:szCs w:val="24"/>
+              </w:rPr>
+              <w:t xml:space="preserve">Security vs usability: uniform terse refusals prevent leaks, but a wrongly refused legitimate question gets no help, and the sanitizer can over-strip or be paraphrased around.</w:t>
+            </w:r>
+          </w:p>
+          <w:p>
+            <w:pPr>
+              <w:spacing w:after="120"/>
+            </w:pPr>
+            <w:r>
+              <w:rPr>
+                <w:sz w:val="24"/>
+                <w:szCs w:val="24"/>
+              </w:rPr>
+              <w:t xml:space="preserve">Cost vs quality: the direct path is roughly half the tokens but does no planning, so a misrouted multi-hop question gets incomplete context; the router is a crude heuristic.</w:t>
+            </w:r>
+          </w:p>
+          <w:p>
+            <w:pPr>
+              <w:spacing w:after="120"/>
+            </w:pPr>
+            <w:r>
+              <w:rPr>
+                <w:sz w:val="24"/>
+                <w:szCs w:val="24"/>
+              </w:rPr>
+              <w:t xml:space="preserve">The cache saves 100% on repeats but can serve stale answers; not caching refusals limits the risk.</w:t>
+            </w:r>
           </w:p>
           <w:p>
             <w:pPr>
@@ -1900,11 +2074,14 @@
           <w:p>
             <w:pPr>
               <w:spacing w:after="120"/>
-              <w:rPr>
-                <w:sz w:val="24"/>
-                <w:szCs w:val="24"/>
-              </w:rPr>
             </w:pPr>
+            <w:r>
+              <w:rPr>
+                <w:sz w:val="24"/>
+                <w:szCs w:val="24"/>
+              </w:rPr>
+              <w:t xml:space="preserve">Effective on the 6.1 problems: refusal format 0/4 to 4/4, the role-play probe no longer succeeds, repeats are free and simple questions cheaper, with quality held on three questions. The evidence is small (one run, 3 passages, 4 probes), so it shows direction, not a production estimate.</w:t>
+            </w:r>
           </w:p>
         </w:tc>
       </w:tr>
@@ -1996,11 +2173,14 @@
           <w:p>
             <w:pPr>
               <w:spacing w:after="120"/>
-              <w:rPr>
-                <w:sz w:val="24"/>
-                <w:szCs w:val="24"/>
-              </w:rPr>
             </w:pPr>
+            <w:r>
+              <w:rPr>
+                <w:sz w:val="24"/>
+                <w:szCs w:val="24"/>
+              </w:rPr>
+              <w:t xml:space="preserve">Multi-turn role-play can still wear the model down; the exact-match cache misses paraphrases; the sanitizer may mangle legitimate queries; ambiguous questions (P8) still pick one reading. The safeguards are tested in the 7.1 harness, not yet ported into the full 5.1 agent over 153 PDFs.</w:t>
+            </w:r>
           </w:p>
         </w:tc>
       </w:tr>
@@ -2092,11 +2272,50 @@
           <w:p>
             <w:pPr>
               <w:spacing w:after="120"/>
-              <w:rPr>
-                <w:sz w:val="24"/>
-                <w:szCs w:val="24"/>
-              </w:rPr>
             </w:pPr>
+            <w:r>
+              <w:rPr>
+                <w:sz w:val="24"/>
+                <w:szCs w:val="24"/>
+              </w:rPr>
+              <w:t xml:space="preserve">1. Port the safeguards into the 5.1 agent and re-run probes P1-P10 and eval_queries.json on the real corpus.</w:t>
+            </w:r>
+          </w:p>
+          <w:p>
+            <w:pPr>
+              <w:spacing w:after="120"/>
+            </w:pPr>
+            <w:r>
+              <w:rPr>
+                <w:sz w:val="24"/>
+                <w:szCs w:val="24"/>
+              </w:rPr>
+              <w:t xml:space="preserve">2. Stop the planner from skipping retrieval on research questions.</w:t>
+            </w:r>
+          </w:p>
+          <w:p>
+            <w:pPr>
+              <w:spacing w:after="120"/>
+            </w:pPr>
+            <w:r>
+              <w:rPr>
+                <w:sz w:val="24"/>
+                <w:szCs w:val="24"/>
+              </w:rPr>
+              <w:t xml:space="preserve">3. Use a semantic cache (threshold, TTL), a model-based router and a cheaper planner model.</w:t>
+            </w:r>
+          </w:p>
+          <w:p>
+            <w:pPr>
+              <w:spacing w:after="120"/>
+            </w:pPr>
+            <w:r>
+              <w:rPr>
+                <w:sz w:val="24"/>
+                <w:szCs w:val="24"/>
+              </w:rPr>
+              <w:t xml:space="preserve">4. Add multi-turn attack tests and monitor cache hit rate, refusal rate and tokens per query.</w:t>
+            </w:r>
           </w:p>
         </w:tc>
       </w:tr>
@@ -2258,10 +2477,16 @@
           <w:p>
             <w:pPr>
               <w:rPr>
-                <w:sz w:val="24"/>
-                <w:szCs w:val="24"/>
+                <w:sz w:val="22"/>
               </w:rPr>
             </w:pPr>
+            <w:r>
+              <w:rPr>
+                <w:sz w:val="24"/>
+                <w:szCs w:val="24"/>
+              </w:rPr>
+              <w:t xml:space="preserve">P1, P5, P7, P10 refusal probes and 3 quality questions, defined in the 7.1 script (REFUSAL_PROBES, run()): https://github.com/Tsingh315/llm-rag-capstone/blob/main/Capstone_Checkpoint_7.1/capstone_checkpoint_7_1_production_ready_starter.py</w:t>
+            </w:r>
           </w:p>
         </w:tc>
       </w:tr>
@@ -2324,10 +2549,16 @@
           <w:p>
             <w:pPr>
               <w:rPr>
-                <w:sz w:val="24"/>
-                <w:szCs w:val="24"/>
+                <w:sz w:val="22"/>
               </w:rPr>
             </w:pPr>
+            <w:r>
+              <w:rPr>
+                <w:sz w:val="24"/>
+                <w:szCs w:val="24"/>
+              </w:rPr>
+              <w:t xml:space="preserve">Cache 684 tokens vs 0 (1,831 ms vs 0 ms); direct path 229-402 tokens: https://github.com/Tsingh315/llm-rag-capstone/blob/main/Capstone_Checkpoint_7.1/checkpoint_7_1_output.txt</w:t>
+            </w:r>
           </w:p>
         </w:tc>
       </w:tr>
@@ -2385,10 +2616,16 @@
           <w:p>
             <w:pPr>
               <w:rPr>
-                <w:sz w:val="24"/>
-                <w:szCs w:val="24"/>
+                <w:sz w:val="22"/>
               </w:rPr>
             </w:pPr>
+            <w:r>
+              <w:rPr>
+                <w:sz w:val="24"/>
+                <w:szCs w:val="24"/>
+              </w:rPr>
+              <w:t xml:space="preserve">Q1, the injection probe and the 4 refusal probes, raw vs hardened: https://github.com/Tsingh315/llm-rag-capstone/blob/main/Capstone_Checkpoint_7.1/checkpoint_7_1_output.txt</w:t>
+            </w:r>
           </w:p>
         </w:tc>
       </w:tr>
@@ -2448,10 +2685,16 @@
           <w:p>
             <w:pPr>
               <w:rPr>
-                <w:sz w:val="24"/>
-                <w:szCs w:val="24"/>
+                <w:sz w:val="22"/>
               </w:rPr>
             </w:pPr>
+            <w:r>
+              <w:rPr>
+                <w:sz w:val="24"/>
+                <w:szCs w:val="24"/>
+              </w:rPr>
+              <w:t xml:space="preserve">Run output and call log (no screenshots): https://github.com/Tsingh315/llm-rag-capstone/blob/main/Capstone_Checkpoint_7.1/checkpoint_7_1_output.txt and https://github.com/Tsingh315/llm-rag-capstone/blob/main/Capstone_Checkpoint_7.1/checkpoint_7_1_agent.log</w:t>
+            </w:r>
           </w:p>
         </w:tc>
       </w:tr>
@@ -2507,10 +2750,16 @@
           <w:p>
             <w:pPr>
               <w:rPr>
-                <w:sz w:val="24"/>
-                <w:szCs w:val="24"/>
+                <w:sz w:val="22"/>
               </w:rPr>
             </w:pPr>
+            <w:r>
+              <w:rPr>
+                <w:sz w:val="24"/>
+                <w:szCs w:val="24"/>
+              </w:rPr>
+              <w:t xml:space="preserve">Repository: https://github.com/Tsingh315/llm-rag-capstone (folder Capstone_Checkpoint_7.1)</w:t>
+            </w:r>
           </w:p>
         </w:tc>
       </w:tr>
@@ -2566,10 +2815,16 @@
           <w:p>
             <w:pPr>
               <w:rPr>
-                <w:sz w:val="24"/>
-                <w:szCs w:val="24"/>
+                <w:sz w:val="22"/>
               </w:rPr>
             </w:pPr>
+            <w:r>
+              <w:rPr>
+                <w:sz w:val="24"/>
+                <w:szCs w:val="24"/>
+              </w:rPr>
+              <w:t xml:space="preserve">6.1 audit baseline: https://github.com/Tsingh315/llm-rag-capstone/blob/main/Capstone_Checkpoint_6.1/README.md</w:t>
+            </w:r>
           </w:p>
         </w:tc>
       </w:tr>

</xml_diff>